<commit_message>
docs: sinh lai bao cao Word theo 9 lop kiem thu moi
</commit_message>
<xml_diff>
--- a/BaoCao-CongViec-Theo-Tuan.docx
+++ b/BaoCao-CongViec-Theo-Tuan.docx
@@ -410,7 +410,7 @@
                 <w:rFonts w:ascii="Times New Roman" w:hAnsi="Times New Roman"/>
                 <w:sz w:val="24"/>
               </w:rPr>
-              <w:t>94 commit</w:t>
+              <w:t>95 commit</w:t>
             </w:r>
           </w:p>
         </w:tc>
@@ -1400,7 +1400,7 @@
                 <w:rFonts w:ascii="Times New Roman" w:hAnsi="Times New Roman"/>
                 <w:sz w:val="24"/>
               </w:rPr>
-              <w:t>25</w:t>
+              <w:t>26</w:t>
             </w:r>
           </w:p>
         </w:tc>
@@ -1417,7 +1417,7 @@
                 <w:rFonts w:ascii="Times New Roman" w:hAnsi="Times New Roman"/>
                 <w:sz w:val="24"/>
               </w:rPr>
-              <w:t>74</w:t>
+              <w:t>118</w:t>
             </w:r>
           </w:p>
         </w:tc>
@@ -1434,7 +1434,7 @@
                 <w:rFonts w:ascii="Times New Roman" w:hAnsi="Times New Roman"/>
                 <w:sz w:val="24"/>
               </w:rPr>
-              <w:t>5.793</w:t>
+              <w:t>8.721</w:t>
             </w:r>
           </w:p>
         </w:tc>
@@ -1502,7 +1502,7 @@
                 <w:rFonts w:ascii="Times New Roman" w:hAnsi="Times New Roman"/>
                 <w:sz w:val="24"/>
               </w:rPr>
-              <w:t>94</w:t>
+              <w:t>95</w:t>
             </w:r>
           </w:p>
         </w:tc>
@@ -1535,7 +1535,7 @@
                 <w:rFonts w:ascii="Times New Roman" w:hAnsi="Times New Roman"/>
                 <w:sz w:val="24"/>
               </w:rPr>
-              <w:t>42.177</w:t>
+              <w:t>45.105</w:t>
             </w:r>
           </w:p>
         </w:tc>
@@ -1700,7 +1700,7 @@
                 <w:rFonts w:ascii="Times New Roman" w:hAnsi="Times New Roman"/>
                 <w:sz w:val="24"/>
               </w:rPr>
-              <w:t>69</w:t>
+              <w:t>70</w:t>
             </w:r>
           </w:p>
         </w:tc>
@@ -2975,7 +2975,7 @@
                 <w:rFonts w:ascii="Times New Roman" w:hAnsi="Times New Roman"/>
                 <w:sz w:val="24"/>
               </w:rPr>
-              <w:t>34</w:t>
+              <w:t>44</w:t>
             </w:r>
           </w:p>
         </w:tc>
@@ -2992,7 +2992,7 @@
                 <w:rFonts w:ascii="Times New Roman" w:hAnsi="Times New Roman"/>
                 <w:sz w:val="24"/>
               </w:rPr>
-              <w:t>311</w:t>
+              <w:t>417</w:t>
             </w:r>
           </w:p>
         </w:tc>
@@ -3009,7 +3009,7 @@
                 <w:rFonts w:ascii="Times New Roman" w:hAnsi="Times New Roman"/>
                 <w:sz w:val="24"/>
               </w:rPr>
-              <w:t>77,0%</w:t>
+              <w:t>81,8%</w:t>
             </w:r>
           </w:p>
         </w:tc>
@@ -3079,7 +3079,7 @@
                 <w:rFonts w:ascii="Times New Roman" w:hAnsi="Times New Roman"/>
                 <w:sz w:val="24"/>
               </w:rPr>
-              <w:t>23,0%</w:t>
+              <w:t>18,2%</w:t>
             </w:r>
           </w:p>
         </w:tc>
@@ -3115,7 +3115,7 @@
                 <w:rFonts w:ascii="Times New Roman" w:hAnsi="Times New Roman"/>
                 <w:sz w:val="24"/>
               </w:rPr>
-              <w:t>45</w:t>
+              <w:t>55</w:t>
             </w:r>
           </w:p>
         </w:tc>
@@ -3132,7 +3132,7 @@
                 <w:rFonts w:ascii="Times New Roman" w:hAnsi="Times New Roman"/>
                 <w:sz w:val="24"/>
               </w:rPr>
-              <w:t>404</w:t>
+              <w:t>510</w:t>
             </w:r>
           </w:p>
         </w:tc>
@@ -5749,7 +5749,7 @@
           <w:color w:val="595959"/>
           <w:sz w:val="22"/>
         </w:rPr>
-        <w:t>Buổi học: 09/09/2026   ·   Khoảng thời gian: 09/09 – 15/09/2026   ·   Khối lượng: 25 commit, 74 tệp thay đổi, 5.793 dòng thêm mới</w:t>
+        <w:t>Buổi học: 09/09/2026   ·   Khoảng thời gian: 09/09 – 15/09/2026   ·   Khối lượng: 26 commit, 118 tệp thay đổi, 8.721 dòng thêm mới</w:t>
       </w:r>
     </w:p>
     <w:p>
@@ -5958,7 +5958,7 @@
                 <w:rFonts w:ascii="Times New Roman" w:hAnsi="Times New Roman"/>
                 <w:sz w:val="24"/>
               </w:rPr>
-              <w:t>404 trường hợp trên 45 lớp, không có trường hợp thất bại</w:t>
+              <w:t>510 trường hợp trên 55 lớp, không có trường hợp thất bại</w:t>
             </w:r>
           </w:p>
         </w:tc>

</xml_diff>

<commit_message>
docs: sinh lai bao cao Word theo 536 test tren 57 lop
</commit_message>
<xml_diff>
--- a/BaoCao-CongViec-Theo-Tuan.docx
+++ b/BaoCao-CongViec-Theo-Tuan.docx
@@ -410,7 +410,7 @@
                 <w:rFonts w:ascii="Times New Roman" w:hAnsi="Times New Roman"/>
                 <w:sz w:val="24"/>
               </w:rPr>
-              <w:t>96 commit</w:t>
+              <w:t>97 commit</w:t>
             </w:r>
           </w:p>
         </w:tc>
@@ -1400,7 +1400,7 @@
                 <w:rFonts w:ascii="Times New Roman" w:hAnsi="Times New Roman"/>
                 <w:sz w:val="24"/>
               </w:rPr>
-              <w:t>27</w:t>
+              <w:t>28</w:t>
             </w:r>
           </w:p>
         </w:tc>
@@ -1417,7 +1417,7 @@
                 <w:rFonts w:ascii="Times New Roman" w:hAnsi="Times New Roman"/>
                 <w:sz w:val="24"/>
               </w:rPr>
-              <w:t>118</w:t>
+              <w:t>138</w:t>
             </w:r>
           </w:p>
         </w:tc>
@@ -1434,7 +1434,7 @@
                 <w:rFonts w:ascii="Times New Roman" w:hAnsi="Times New Roman"/>
                 <w:sz w:val="24"/>
               </w:rPr>
-              <w:t>8.721</w:t>
+              <w:t>9.996</w:t>
             </w:r>
           </w:p>
         </w:tc>
@@ -1502,7 +1502,7 @@
                 <w:rFonts w:ascii="Times New Roman" w:hAnsi="Times New Roman"/>
                 <w:sz w:val="24"/>
               </w:rPr>
-              <w:t>96</w:t>
+              <w:t>97</w:t>
             </w:r>
           </w:p>
         </w:tc>
@@ -1535,7 +1535,7 @@
                 <w:rFonts w:ascii="Times New Roman" w:hAnsi="Times New Roman"/>
                 <w:sz w:val="24"/>
               </w:rPr>
-              <w:t>45.105</w:t>
+              <w:t>46.380</w:t>
             </w:r>
           </w:p>
         </w:tc>
@@ -1700,7 +1700,7 @@
                 <w:rFonts w:ascii="Times New Roman" w:hAnsi="Times New Roman"/>
                 <w:sz w:val="24"/>
               </w:rPr>
-              <w:t>71</w:t>
+              <w:t>72</w:t>
             </w:r>
           </w:p>
         </w:tc>
@@ -2975,7 +2975,7 @@
                 <w:rFonts w:ascii="Times New Roman" w:hAnsi="Times New Roman"/>
                 <w:sz w:val="24"/>
               </w:rPr>
-              <w:t>44</w:t>
+              <w:t>46</w:t>
             </w:r>
           </w:p>
         </w:tc>
@@ -2992,7 +2992,7 @@
                 <w:rFonts w:ascii="Times New Roman" w:hAnsi="Times New Roman"/>
                 <w:sz w:val="24"/>
               </w:rPr>
-              <w:t>420</w:t>
+              <w:t>443</w:t>
             </w:r>
           </w:p>
         </w:tc>
@@ -3009,7 +3009,7 @@
                 <w:rFonts w:ascii="Times New Roman" w:hAnsi="Times New Roman"/>
                 <w:sz w:val="24"/>
               </w:rPr>
-              <w:t>81,9%</w:t>
+              <w:t>82,6%</w:t>
             </w:r>
           </w:p>
         </w:tc>
@@ -3079,7 +3079,7 @@
                 <w:rFonts w:ascii="Times New Roman" w:hAnsi="Times New Roman"/>
                 <w:sz w:val="24"/>
               </w:rPr>
-              <w:t>18,1%</w:t>
+              <w:t>17,4%</w:t>
             </w:r>
           </w:p>
         </w:tc>
@@ -3115,7 +3115,7 @@
                 <w:rFonts w:ascii="Times New Roman" w:hAnsi="Times New Roman"/>
                 <w:sz w:val="24"/>
               </w:rPr>
-              <w:t>55</w:t>
+              <w:t>57</w:t>
             </w:r>
           </w:p>
         </w:tc>
@@ -3132,7 +3132,7 @@
                 <w:rFonts w:ascii="Times New Roman" w:hAnsi="Times New Roman"/>
                 <w:sz w:val="24"/>
               </w:rPr>
-              <w:t>513</w:t>
+              <w:t>536</w:t>
             </w:r>
           </w:p>
         </w:tc>
@@ -5749,7 +5749,7 @@
           <w:color w:val="595959"/>
           <w:sz w:val="22"/>
         </w:rPr>
-        <w:t>Buổi học: 09/09/2026   ·   Khoảng thời gian: 09/09 – 15/09/2026   ·   Khối lượng: 27 commit, 118 tệp thay đổi, 8.721 dòng thêm mới</w:t>
+        <w:t>Buổi học: 09/09/2026   ·   Khoảng thời gian: 09/09 – 15/09/2026   ·   Khối lượng: 28 commit, 138 tệp thay đổi, 9.996 dòng thêm mới</w:t>
       </w:r>
     </w:p>
     <w:p>
@@ -5958,7 +5958,7 @@
                 <w:rFonts w:ascii="Times New Roman" w:hAnsi="Times New Roman"/>
                 <w:sz w:val="24"/>
               </w:rPr>
-              <w:t>513 trường hợp trên 55 lớp, không có trường hợp thất bại</w:t>
+              <w:t>536 trường hợp trên 57 lớp, không có trường hợp thất bại</w:t>
             </w:r>
           </w:p>
         </w:tc>

</xml_diff>

<commit_message>
test: them tools/soat_khop_bao_cao.py, sua 4 so hop den con cu trong DEMO.md
Bo kiem tu dong doi chieu moi con so trong bao cao voi ket qua chay that, phu
11 nhom tu ten lop, so test, bao phu, Postman, E2E, so khiem khuyet, cho toi
duong dan tep o sheet 09 va ten lop ma nguon o sheet 10.

Chay lan dau bat duoc 4 cho con cu trong docs/DEMO.md: phan hop den van ghi 103
test (nay 126 sau khi them PasswordPolicyBvaTest va TokenExpiryBvaTest), tong
hop den 130 (nay 153), va bao phu hop den 6,9% (nay 7,4%). Lenh chay o muc 1.1
cung thieu hai lop moi — da bo sung va chay thu lai dung 126 test.

Them dong sheet 10 vao bang 1.2 cua DEMO.md: 23 test.

Ghi lai hai bay da vap khi viet chinh script nay: thuoc tinh name trong
TEST-*.xml la @DisplayName chu khong phai ten lop, va -Dtest=... khong don
target/surefire-reports nen dem thu muc do sau khi chay chon loc se cong luon
bao cao cua lan chay truoc.
</commit_message>
<xml_diff>
--- a/BaoCao-CongViec-Theo-Tuan.docx
+++ b/BaoCao-CongViec-Theo-Tuan.docx
@@ -410,7 +410,7 @@
                 <w:rFonts w:ascii="Times New Roman" w:hAnsi="Times New Roman"/>
                 <w:sz w:val="24"/>
               </w:rPr>
-              <w:t>97 commit</w:t>
+              <w:t>98 commit</w:t>
             </w:r>
           </w:p>
         </w:tc>
@@ -1400,7 +1400,7 @@
                 <w:rFonts w:ascii="Times New Roman" w:hAnsi="Times New Roman"/>
                 <w:sz w:val="24"/>
               </w:rPr>
-              <w:t>28</w:t>
+              <w:t>29</w:t>
             </w:r>
           </w:p>
         </w:tc>
@@ -1502,7 +1502,7 @@
                 <w:rFonts w:ascii="Times New Roman" w:hAnsi="Times New Roman"/>
                 <w:sz w:val="24"/>
               </w:rPr>
-              <w:t>97</w:t>
+              <w:t>98</w:t>
             </w:r>
           </w:p>
         </w:tc>
@@ -1700,7 +1700,7 @@
                 <w:rFonts w:ascii="Times New Roman" w:hAnsi="Times New Roman"/>
                 <w:sz w:val="24"/>
               </w:rPr>
-              <w:t>72</w:t>
+              <w:t>73</w:t>
             </w:r>
           </w:p>
         </w:tc>
@@ -5749,7 +5749,7 @@
           <w:color w:val="595959"/>
           <w:sz w:val="22"/>
         </w:rPr>
-        <w:t>Buổi học: 09/09/2026   ·   Khoảng thời gian: 09/09 – 15/09/2026   ·   Khối lượng: 28 commit, 138 tệp thay đổi, 9.996 dòng thêm mới</w:t>
+        <w:t>Buổi học: 09/09/2026   ·   Khoảng thời gian: 09/09 – 15/09/2026   ·   Khối lượng: 29 commit, 138 tệp thay đổi, 9.996 dòng thêm mới</w:t>
       </w:r>
     </w:p>
     <w:p>

</xml_diff>

<commit_message>
docs: sinh lai bao cao Word theo 539 test
</commit_message>
<xml_diff>
--- a/BaoCao-CongViec-Theo-Tuan.docx
+++ b/BaoCao-CongViec-Theo-Tuan.docx
@@ -410,7 +410,7 @@
                 <w:rFonts w:ascii="Times New Roman" w:hAnsi="Times New Roman"/>
                 <w:sz w:val="24"/>
               </w:rPr>
-              <w:t>98 commit</w:t>
+              <w:t>100 commit</w:t>
             </w:r>
           </w:p>
         </w:tc>
@@ -1400,7 +1400,7 @@
                 <w:rFonts w:ascii="Times New Roman" w:hAnsi="Times New Roman"/>
                 <w:sz w:val="24"/>
               </w:rPr>
-              <w:t>29</w:t>
+              <w:t>31</w:t>
             </w:r>
           </w:p>
         </w:tc>
@@ -1417,7 +1417,7 @@
                 <w:rFonts w:ascii="Times New Roman" w:hAnsi="Times New Roman"/>
                 <w:sz w:val="24"/>
               </w:rPr>
-              <w:t>138</w:t>
+              <w:t>155</w:t>
             </w:r>
           </w:p>
         </w:tc>
@@ -1434,7 +1434,7 @@
                 <w:rFonts w:ascii="Times New Roman" w:hAnsi="Times New Roman"/>
                 <w:sz w:val="24"/>
               </w:rPr>
-              <w:t>9.996</w:t>
+              <w:t>10.587</w:t>
             </w:r>
           </w:p>
         </w:tc>
@@ -1502,7 +1502,7 @@
                 <w:rFonts w:ascii="Times New Roman" w:hAnsi="Times New Roman"/>
                 <w:sz w:val="24"/>
               </w:rPr>
-              <w:t>98</w:t>
+              <w:t>100</w:t>
             </w:r>
           </w:p>
         </w:tc>
@@ -1535,7 +1535,7 @@
                 <w:rFonts w:ascii="Times New Roman" w:hAnsi="Times New Roman"/>
                 <w:sz w:val="24"/>
               </w:rPr>
-              <w:t>46.380</w:t>
+              <w:t>46.971</w:t>
             </w:r>
           </w:p>
         </w:tc>
@@ -1700,7 +1700,7 @@
                 <w:rFonts w:ascii="Times New Roman" w:hAnsi="Times New Roman"/>
                 <w:sz w:val="24"/>
               </w:rPr>
-              <w:t>73</w:t>
+              <w:t>75</w:t>
             </w:r>
           </w:p>
         </w:tc>
@@ -2992,7 +2992,7 @@
                 <w:rFonts w:ascii="Times New Roman" w:hAnsi="Times New Roman"/>
                 <w:sz w:val="24"/>
               </w:rPr>
-              <w:t>443</w:t>
+              <w:t>446</w:t>
             </w:r>
           </w:p>
         </w:tc>
@@ -3009,7 +3009,7 @@
                 <w:rFonts w:ascii="Times New Roman" w:hAnsi="Times New Roman"/>
                 <w:sz w:val="24"/>
               </w:rPr>
-              <w:t>82,6%</w:t>
+              <w:t>82,7%</w:t>
             </w:r>
           </w:p>
         </w:tc>
@@ -3079,7 +3079,7 @@
                 <w:rFonts w:ascii="Times New Roman" w:hAnsi="Times New Roman"/>
                 <w:sz w:val="24"/>
               </w:rPr>
-              <w:t>17,4%</w:t>
+              <w:t>17,3%</w:t>
             </w:r>
           </w:p>
         </w:tc>
@@ -3132,7 +3132,7 @@
                 <w:rFonts w:ascii="Times New Roman" w:hAnsi="Times New Roman"/>
                 <w:sz w:val="24"/>
               </w:rPr>
-              <w:t>536</w:t>
+              <w:t>539</w:t>
             </w:r>
           </w:p>
         </w:tc>
@@ -5749,7 +5749,7 @@
           <w:color w:val="595959"/>
           <w:sz w:val="22"/>
         </w:rPr>
-        <w:t>Buổi học: 09/09/2026   ·   Khoảng thời gian: 09/09 – 15/09/2026   ·   Khối lượng: 29 commit, 138 tệp thay đổi, 9.996 dòng thêm mới</w:t>
+        <w:t>Buổi học: 09/09/2026   ·   Khoảng thời gian: 09/09 – 15/09/2026   ·   Khối lượng: 31 commit, 155 tệp thay đổi, 10.587 dòng thêm mới</w:t>
       </w:r>
     </w:p>
     <w:p>
@@ -5958,7 +5958,7 @@
                 <w:rFonts w:ascii="Times New Roman" w:hAnsi="Times New Roman"/>
                 <w:sz w:val="24"/>
               </w:rPr>
-              <w:t>536 trường hợp trên 57 lớp, không có trường hợp thất bại</w:t>
+              <w:t>539 trường hợp trên 57 lớp, không có trường hợp thất bại</w:t>
             </w:r>
           </w:p>
         </w:tc>

</xml_diff>

<commit_message>
docs: sinh lai bao cao Word theo 572 test
</commit_message>
<xml_diff>
--- a/BaoCao-CongViec-Theo-Tuan.docx
+++ b/BaoCao-CongViec-Theo-Tuan.docx
@@ -410,7 +410,7 @@
                 <w:rFonts w:ascii="Times New Roman" w:hAnsi="Times New Roman"/>
                 <w:sz w:val="24"/>
               </w:rPr>
-              <w:t>100 commit</w:t>
+              <w:t>102 commit</w:t>
             </w:r>
           </w:p>
         </w:tc>
@@ -1400,7 +1400,7 @@
                 <w:rFonts w:ascii="Times New Roman" w:hAnsi="Times New Roman"/>
                 <w:sz w:val="24"/>
               </w:rPr>
-              <w:t>31</w:t>
+              <w:t>33</w:t>
             </w:r>
           </w:p>
         </w:tc>
@@ -1417,7 +1417,7 @@
                 <w:rFonts w:ascii="Times New Roman" w:hAnsi="Times New Roman"/>
                 <w:sz w:val="24"/>
               </w:rPr>
-              <w:t>155</w:t>
+              <w:t>185</w:t>
             </w:r>
           </w:p>
         </w:tc>
@@ -1434,7 +1434,7 @@
                 <w:rFonts w:ascii="Times New Roman" w:hAnsi="Times New Roman"/>
                 <w:sz w:val="24"/>
               </w:rPr>
-              <w:t>10.587</w:t>
+              <w:t>11.318</w:t>
             </w:r>
           </w:p>
         </w:tc>
@@ -1502,7 +1502,7 @@
                 <w:rFonts w:ascii="Times New Roman" w:hAnsi="Times New Roman"/>
                 <w:sz w:val="24"/>
               </w:rPr>
-              <w:t>100</w:t>
+              <w:t>102</w:t>
             </w:r>
           </w:p>
         </w:tc>
@@ -1535,7 +1535,7 @@
                 <w:rFonts w:ascii="Times New Roman" w:hAnsi="Times New Roman"/>
                 <w:sz w:val="24"/>
               </w:rPr>
-              <w:t>46.971</w:t>
+              <w:t>47.702</w:t>
             </w:r>
           </w:p>
         </w:tc>
@@ -1700,7 +1700,7 @@
                 <w:rFonts w:ascii="Times New Roman" w:hAnsi="Times New Roman"/>
                 <w:sz w:val="24"/>
               </w:rPr>
-              <w:t>75</w:t>
+              <w:t>77</w:t>
             </w:r>
           </w:p>
         </w:tc>
@@ -2975,7 +2975,7 @@
                 <w:rFonts w:ascii="Times New Roman" w:hAnsi="Times New Roman"/>
                 <w:sz w:val="24"/>
               </w:rPr>
-              <w:t>46</w:t>
+              <w:t>47</w:t>
             </w:r>
           </w:p>
         </w:tc>
@@ -2992,7 +2992,7 @@
                 <w:rFonts w:ascii="Times New Roman" w:hAnsi="Times New Roman"/>
                 <w:sz w:val="24"/>
               </w:rPr>
-              <w:t>446</w:t>
+              <w:t>466</w:t>
             </w:r>
           </w:p>
         </w:tc>
@@ -3009,7 +3009,7 @@
                 <w:rFonts w:ascii="Times New Roman" w:hAnsi="Times New Roman"/>
                 <w:sz w:val="24"/>
               </w:rPr>
-              <w:t>82,7%</w:t>
+              <w:t>81,5%</w:t>
             </w:r>
           </w:p>
         </w:tc>
@@ -3062,7 +3062,7 @@
                 <w:rFonts w:ascii="Times New Roman" w:hAnsi="Times New Roman"/>
                 <w:sz w:val="24"/>
               </w:rPr>
-              <w:t>93</w:t>
+              <w:t>106</w:t>
             </w:r>
           </w:p>
         </w:tc>
@@ -3079,7 +3079,7 @@
                 <w:rFonts w:ascii="Times New Roman" w:hAnsi="Times New Roman"/>
                 <w:sz w:val="24"/>
               </w:rPr>
-              <w:t>17,3%</w:t>
+              <w:t>18,5%</w:t>
             </w:r>
           </w:p>
         </w:tc>
@@ -3115,7 +3115,7 @@
                 <w:rFonts w:ascii="Times New Roman" w:hAnsi="Times New Roman"/>
                 <w:sz w:val="24"/>
               </w:rPr>
-              <w:t>57</w:t>
+              <w:t>58</w:t>
             </w:r>
           </w:p>
         </w:tc>
@@ -3132,7 +3132,7 @@
                 <w:rFonts w:ascii="Times New Roman" w:hAnsi="Times New Roman"/>
                 <w:sz w:val="24"/>
               </w:rPr>
-              <w:t>539</w:t>
+              <w:t>572</w:t>
             </w:r>
           </w:p>
         </w:tc>
@@ -5749,7 +5749,7 @@
           <w:color w:val="595959"/>
           <w:sz w:val="22"/>
         </w:rPr>
-        <w:t>Buổi học: 09/09/2026   ·   Khoảng thời gian: 09/09 – 15/09/2026   ·   Khối lượng: 31 commit, 155 tệp thay đổi, 10.587 dòng thêm mới</w:t>
+        <w:t>Buổi học: 09/09/2026   ·   Khoảng thời gian: 09/09 – 15/09/2026   ·   Khối lượng: 33 commit, 185 tệp thay đổi, 11.318 dòng thêm mới</w:t>
       </w:r>
     </w:p>
     <w:p>
@@ -5958,7 +5958,7 @@
                 <w:rFonts w:ascii="Times New Roman" w:hAnsi="Times New Roman"/>
                 <w:sz w:val="24"/>
               </w:rPr>
-              <w:t>539 trường hợp trên 57 lớp, không có trường hợp thất bại</w:t>
+              <w:t>572 trường hợp trên 58 lớp, không có trường hợp thất bại</w:t>
             </w:r>
           </w:p>
         </w:tc>

</xml_diff>